<commit_message>
add: solution for task 1
</commit_message>
<xml_diff>
--- a/Question_A.docx
+++ b/Question_A.docx
@@ -49,11 +49,19 @@
         <w:rPr>
           <w:lang w:eastAsia="zh-CN"/>
         </w:rPr>
-        <w:t>近年来，共享单车已成为宁波市居民短途出行的重要交通工具，尤其在高校聚集的大学城区域，共享单车日借还量巨大。然而，由于早晚高峰期大量用户从住宅区骑</w:t>
+        <w:t>近年来，共享单车已成为宁波市居民短途出行的重要交通工具，尤其在高校聚集的大学城区域，共享单车日借还量巨大。然而，由于</w:t>
+      </w:r>
+      <w:r>
+        <w:rPr>
+          <w:highlight w:val="yellow"/>
+          <w:lang w:eastAsia="zh-CN"/>
+        </w:rPr>
+        <w:t>早晚高峰期大量用户从住宅区骑</w:t>
       </w:r>
       <w:proofErr w:type="gramStart"/>
       <w:r>
         <w:rPr>
+          <w:highlight w:val="yellow"/>
           <w:lang w:eastAsia="zh-CN"/>
         </w:rPr>
         <w:t>往教学</w:t>
@@ -61,9 +69,16 @@
       <w:proofErr w:type="gramEnd"/>
       <w:r>
         <w:rPr>
-          <w:lang w:eastAsia="zh-CN"/>
-        </w:rPr>
-        <w:t>区、食堂和图书馆，导致热门站点（如教学楼、地铁口）车辆迅速被借空，而偏远站点则产生大量积压，运营效率低下，用户体验差。</w:t>
+          <w:highlight w:val="yellow"/>
+          <w:lang w:eastAsia="zh-CN"/>
+        </w:rPr>
+        <w:t>区、食堂和图书馆</w:t>
+      </w:r>
+      <w:r>
+        <w:rPr>
+          <w:lang w:eastAsia="zh-CN"/>
+        </w:rPr>
+        <w:t>，导致热门站点（如教学楼、地铁口）车辆迅速被借空，而偏远站点则产生大量积压，运营效率低下，用户体验差。</w:t>
       </w:r>
     </w:p>
     <w:p>
@@ -93,7 +108,20 @@
         <w:rPr>
           <w:lang w:eastAsia="zh-CN"/>
         </w:rPr>
-        <w:t>经验，调度时机和数量难以精确匹配需求，且成本较高。为此，有必要建立数学模型，基于历史数据分析用车规律，制定科学合理的调度策略，以最小化调度成本与用户等待损失。</w:t>
+        <w:t>经验，调度时机和数量难以精确匹配需求，且成本较高。为此，有必要建立数学模型，</w:t>
+      </w:r>
+      <w:r>
+        <w:rPr>
+          <w:highlight w:val="yellow"/>
+          <w:lang w:eastAsia="zh-CN"/>
+        </w:rPr>
+        <w:t>基于历史数据</w:t>
+      </w:r>
+      <w:r>
+        <w:rPr>
+          <w:lang w:eastAsia="zh-CN"/>
+        </w:rPr>
+        <w:t>分析用车规律，制定科学合理的调度策略，以最小化调度成本与用户等待损失。</w:t>
       </w:r>
     </w:p>
     <w:p>
@@ -155,7 +183,20 @@
         <w:rPr>
           <w:lang w:eastAsia="zh-CN"/>
         </w:rPr>
-        <w:t>• 附件2_每小时借还记录.csv：包含2025年4月7日至4月13日（7天）每小时各站点的借出量与归还量数据（共5040条记录）。</w:t>
+        <w:t>• 附件2_</w:t>
+      </w:r>
+      <w:r>
+        <w:rPr>
+          <w:highlight w:val="yellow"/>
+          <w:lang w:eastAsia="zh-CN"/>
+        </w:rPr>
+        <w:t>每小时</w:t>
+      </w:r>
+      <w:r>
+        <w:rPr>
+          <w:lang w:eastAsia="zh-CN"/>
+        </w:rPr>
+        <w:t>借还记录.csv：包含2025年4月7日至4月13日（7天）每小时各站点的借出量与归还量数据（共5040条记录）。</w:t>
       </w:r>
     </w:p>
     <w:p>
@@ -184,7 +225,20 @@
         <w:rPr>
           <w:lang w:eastAsia="zh-CN"/>
         </w:rPr>
-        <w:t>、每公里运输成本、满桩/空桩惩罚系数等参数。</w:t>
+        <w:t>、每公里运输成本、</w:t>
+      </w:r>
+      <w:r>
+        <w:rPr>
+          <w:highlight w:val="yellow"/>
+          <w:lang w:eastAsia="zh-CN"/>
+        </w:rPr>
+        <w:t>满桩/空桩惩罚系数</w:t>
+      </w:r>
+      <w:r>
+        <w:rPr>
+          <w:lang w:eastAsia="zh-CN"/>
+        </w:rPr>
+        <w:t>等参数。</w:t>
       </w:r>
     </w:p>
     <w:p>
@@ -248,7 +302,20 @@
         <w:rPr>
           <w:lang w:eastAsia="zh-CN"/>
         </w:rPr>
-        <w:t>根据附件2数据，分析宁波大学城区域30个站点的日借还规律，识别出：</w:t>
+        <w:t>根据附件2数据，分析宁波大学城区域30个站点的</w:t>
+      </w:r>
+      <w:r>
+        <w:rPr>
+          <w:highlight w:val="yellow"/>
+          <w:lang w:eastAsia="zh-CN"/>
+        </w:rPr>
+        <w:t>日借还规律</w:t>
+      </w:r>
+      <w:r>
+        <w:rPr>
+          <w:lang w:eastAsia="zh-CN"/>
+        </w:rPr>
+        <w:t>，识别出：</w:t>
       </w:r>
     </w:p>
     <w:p>
@@ -263,7 +330,33 @@
         <w:rPr>
           <w:lang w:eastAsia="zh-CN"/>
         </w:rPr>
-        <w:t>（1）全天中典型的高峰时段（借出峰和归还峰）及其持续时长；</w:t>
+        <w:t>（1）全天中典型的</w:t>
+      </w:r>
+      <w:r>
+        <w:rPr>
+          <w:highlight w:val="yellow"/>
+          <w:lang w:eastAsia="zh-CN"/>
+        </w:rPr>
+        <w:t>高峰时段（借出峰和归还峰）</w:t>
+      </w:r>
+      <w:r>
+        <w:rPr>
+          <w:lang w:eastAsia="zh-CN"/>
+        </w:rPr>
+        <w:t>及其</w:t>
+      </w:r>
+      <w:r>
+        <w:rPr>
+          <w:highlight w:val="yellow"/>
+          <w:lang w:eastAsia="zh-CN"/>
+        </w:rPr>
+        <w:t>持续时长</w:t>
+      </w:r>
+      <w:r>
+        <w:rPr>
+          <w:lang w:eastAsia="zh-CN"/>
+        </w:rPr>
+        <w:t>；</w:t>
       </w:r>
     </w:p>
     <w:p>
@@ -294,7 +387,20 @@
         <w:rPr>
           <w:lang w:eastAsia="zh-CN"/>
         </w:rPr>
-        <w:t>（3）工作日与休息日借还模式的主要差异。</w:t>
+        <w:t>（3）</w:t>
+      </w:r>
+      <w:r>
+        <w:rPr>
+          <w:highlight w:val="yellow"/>
+          <w:lang w:eastAsia="zh-CN"/>
+        </w:rPr>
+        <w:t>工作日与休息日借还模式</w:t>
+      </w:r>
+      <w:r>
+        <w:rPr>
+          <w:lang w:eastAsia="zh-CN"/>
+        </w:rPr>
+        <w:t>的主要差异。</w:t>
       </w:r>
     </w:p>
     <w:p>
@@ -356,7 +462,46 @@
         <w:rPr>
           <w:lang w:eastAsia="zh-CN"/>
         </w:rPr>
-        <w:t>基于历史数据，建立一个对未来1天（24小时）各站点每小时借还量的预测模型。要求：</w:t>
+        <w:t>基于历史数据，建立一个对</w:t>
+      </w:r>
+      <w:r>
+        <w:rPr>
+          <w:highlight w:val="yellow"/>
+          <w:lang w:eastAsia="zh-CN"/>
+        </w:rPr>
+        <w:t>未来1天</w:t>
+      </w:r>
+      <w:r>
+        <w:rPr>
+          <w:lang w:eastAsia="zh-CN"/>
+        </w:rPr>
+        <w:t>（24小时）各站点</w:t>
+      </w:r>
+      <w:r>
+        <w:rPr>
+          <w:highlight w:val="yellow"/>
+          <w:lang w:eastAsia="zh-CN"/>
+        </w:rPr>
+        <w:t>每小时</w:t>
+      </w:r>
+      <w:r>
+        <w:rPr>
+          <w:lang w:eastAsia="zh-CN"/>
+        </w:rPr>
+        <w:t>借还量的</w:t>
+      </w:r>
+      <w:r>
+        <w:rPr>
+          <w:highlight w:val="yellow"/>
+          <w:lang w:eastAsia="zh-CN"/>
+        </w:rPr>
+        <w:t>预测模型</w:t>
+      </w:r>
+      <w:r>
+        <w:rPr>
+          <w:lang w:eastAsia="zh-CN"/>
+        </w:rPr>
+        <w:t>。要求：</w:t>
       </w:r>
     </w:p>
     <w:p>
@@ -386,7 +531,20 @@
         <w:rPr>
           <w:lang w:eastAsia="zh-CN"/>
         </w:rPr>
-        <w:t>（2）以附件2中最后一天（2025-04-13，周日）数据为测试集，评估模型的预测精度；</w:t>
+        <w:t>（2）以附件2中</w:t>
+      </w:r>
+      <w:r>
+        <w:rPr>
+          <w:highlight w:val="yellow"/>
+          <w:lang w:eastAsia="zh-CN"/>
+        </w:rPr>
+        <w:t>最后一天（2025-04-13，周日）数据为测试集</w:t>
+      </w:r>
+      <w:r>
+        <w:rPr>
+          <w:lang w:eastAsia="zh-CN"/>
+        </w:rPr>
+        <w:t>，评估模型的预测精度；</w:t>
       </w:r>
     </w:p>
     <w:p>
@@ -401,7 +559,20 @@
         <w:rPr>
           <w:lang w:eastAsia="zh-CN"/>
         </w:rPr>
-        <w:t>（3）给出至少3个代表性站点在</w:t>
+        <w:t>（3）给出至少</w:t>
+      </w:r>
+      <w:r>
+        <w:rPr>
+          <w:highlight w:val="yellow"/>
+          <w:lang w:eastAsia="zh-CN"/>
+        </w:rPr>
+        <w:t>3个</w:t>
+      </w:r>
+      <w:r>
+        <w:rPr>
+          <w:lang w:eastAsia="zh-CN"/>
+        </w:rPr>
+        <w:t>代表性站点在</w:t>
       </w:r>
       <w:proofErr w:type="gramStart"/>
       <w:r>
@@ -415,7 +586,20 @@
         <w:rPr>
           <w:lang w:eastAsia="zh-CN"/>
         </w:rPr>
-        <w:t>的预测曲线与实际值对比图。</w:t>
+        <w:t>的</w:t>
+      </w:r>
+      <w:r>
+        <w:rPr>
+          <w:highlight w:val="yellow"/>
+          <w:lang w:eastAsia="zh-CN"/>
+        </w:rPr>
+        <w:t>预测曲线与实际值对比图</w:t>
+      </w:r>
+      <w:r>
+        <w:rPr>
+          <w:lang w:eastAsia="zh-CN"/>
+        </w:rPr>
+        <w:t>。</w:t>
       </w:r>
     </w:p>
     <w:p>
@@ -445,9 +629,16 @@
       </w:pPr>
       <w:r>
         <w:rPr>
-          <w:lang w:eastAsia="zh-CN"/>
-        </w:rPr>
-        <w:t>基于需求预测结果，建立最优调度方案模型。要求：</w:t>
+          <w:highlight w:val="cyan"/>
+          <w:lang w:eastAsia="zh-CN"/>
+        </w:rPr>
+        <w:t>基于需求预测结果</w:t>
+      </w:r>
+      <w:r>
+        <w:rPr>
+          <w:lang w:eastAsia="zh-CN"/>
+        </w:rPr>
+        <w:t>，建立最优调度方案模型。要求：</w:t>
       </w:r>
     </w:p>
     <w:p>
@@ -541,7 +732,15 @@
           <w:rFonts w:hint="eastAsia"/>
           <w:lang w:eastAsia="zh-CN"/>
         </w:rPr>
-        <w:t>惩罚每整点小时计算一次</w:t>
+        <w:t>惩罚</w:t>
+      </w:r>
+      <w:r>
+        <w:rPr>
+          <w:rFonts w:hint="eastAsia"/>
+          <w:highlight w:val="yellow"/>
+          <w:lang w:eastAsia="zh-CN"/>
+        </w:rPr>
+        <w:t>每整点小时计算一次</w:t>
       </w:r>
     </w:p>
     <w:p>
@@ -618,7 +817,22 @@
           <w:rFonts w:hint="eastAsia"/>
           <w:lang w:eastAsia="zh-CN"/>
         </w:rPr>
-        <w:t>调度必须在整点进行</w:t>
+        <w:t>调度必须在</w:t>
+      </w:r>
+      <w:r>
+        <w:rPr>
+          <w:rFonts w:hint="eastAsia"/>
+          <w:highlight w:val="yellow"/>
+          <w:lang w:eastAsia="zh-CN"/>
+        </w:rPr>
+        <w:t>整点</w:t>
+      </w:r>
+      <w:r>
+        <w:rPr>
+          <w:rFonts w:hint="eastAsia"/>
+          <w:lang w:eastAsia="zh-CN"/>
+        </w:rPr>
+        <w:t>进行</w:t>
       </w:r>
     </w:p>
     <w:p>
@@ -639,7 +853,22 @@
           <w:rFonts w:hint="eastAsia"/>
           <w:lang w:eastAsia="zh-CN"/>
         </w:rPr>
-        <w:t>调度时间可按直线距离四舍五入取整</w:t>
+        <w:t>调度时间可按</w:t>
+      </w:r>
+      <w:r>
+        <w:rPr>
+          <w:rFonts w:hint="eastAsia"/>
+          <w:highlight w:val="cyan"/>
+          <w:lang w:eastAsia="zh-CN"/>
+        </w:rPr>
+        <w:t>直线距离</w:t>
+      </w:r>
+      <w:r>
+        <w:rPr>
+          <w:rFonts w:hint="eastAsia"/>
+          <w:lang w:eastAsia="zh-CN"/>
+        </w:rPr>
+        <w:t>四舍五入取整</w:t>
       </w:r>
     </w:p>
     <w:p>
@@ -654,7 +883,20 @@
         <w:rPr>
           <w:lang w:eastAsia="zh-CN"/>
         </w:rPr>
-        <w:t>（1）以最小化日总费用（运输成本 + 满桩/空桩惩罚成本）为目标函数，写出完整的数学规划模型（含决策变量、约束条件）；</w:t>
+        <w:t>（1）以</w:t>
+      </w:r>
+      <w:r>
+        <w:rPr>
+          <w:highlight w:val="yellow"/>
+          <w:lang w:eastAsia="zh-CN"/>
+        </w:rPr>
+        <w:t>最小化日总费用</w:t>
+      </w:r>
+      <w:r>
+        <w:rPr>
+          <w:lang w:eastAsia="zh-CN"/>
+        </w:rPr>
+        <w:t>（运输成本 + 满桩/空桩惩罚成本）为目标函数，写出完整的数学规划模型（含决策变量、约束条件）；</w:t>
       </w:r>
     </w:p>
     <w:p>
@@ -669,17 +911,47 @@
         <w:rPr>
           <w:lang w:eastAsia="zh-CN"/>
         </w:rPr>
-        <w:t>（2）求解一个工作日内的最优调度路线与调度量（出发站、目标站、车辆数及时间），并与无调度情况对比</w:t>
+        <w:t>（2）求解一个工作日内的最优调度路线与调度量（出发站、目标站、车辆数及时间），并</w:t>
+      </w:r>
+      <w:r>
+        <w:rPr>
+          <w:highlight w:val="yellow"/>
+          <w:lang w:eastAsia="zh-CN"/>
+        </w:rPr>
+        <w:t>与</w:t>
+      </w:r>
+      <w:r>
+        <w:rPr>
+          <w:highlight w:val="cyan"/>
+          <w:lang w:eastAsia="zh-CN"/>
+        </w:rPr>
+        <w:t>无调度情况</w:t>
+      </w:r>
+      <w:r>
+        <w:rPr>
+          <w:highlight w:val="yellow"/>
+          <w:lang w:eastAsia="zh-CN"/>
+        </w:rPr>
+        <w:t>对比</w:t>
       </w:r>
       <w:r>
         <w:rPr>
           <w:rFonts w:hint="eastAsia"/>
           <w:lang w:eastAsia="zh-CN"/>
         </w:rPr>
-        <w:t>，对比指标应包括</w:t>
-      </w:r>
-      <w:r>
-        <w:rPr>
+        <w:t>，</w:t>
+      </w:r>
+      <w:r>
+        <w:rPr>
+          <w:rFonts w:hint="eastAsia"/>
+          <w:highlight w:val="yellow"/>
+          <w:lang w:eastAsia="zh-CN"/>
+        </w:rPr>
+        <w:t>对比指标应包括</w:t>
+      </w:r>
+      <w:r>
+        <w:rPr>
+          <w:highlight w:val="yellow"/>
           <w:lang w:eastAsia="zh-CN"/>
         </w:rPr>
         <w:t>总费用、满桩/空</w:t>
@@ -687,6 +959,7 @@
       <w:proofErr w:type="gramStart"/>
       <w:r>
         <w:rPr>
+          <w:highlight w:val="yellow"/>
           <w:lang w:eastAsia="zh-CN"/>
         </w:rPr>
         <w:t>桩发生</w:t>
@@ -694,6 +967,7 @@
       <w:proofErr w:type="gramEnd"/>
       <w:r>
         <w:rPr>
+          <w:highlight w:val="yellow"/>
           <w:lang w:eastAsia="zh-CN"/>
         </w:rPr>
         <w:t>次数、用户无法借车/还车的次数</w:t>
@@ -725,12 +999,21 @@
           <w:rFonts w:hint="eastAsia"/>
           <w:lang w:eastAsia="zh-CN"/>
         </w:rPr>
-        <w:t>影响，如何优化调度模型平衡用户需求率和</w:t>
+        <w:t>影响，如何优化调度模型</w:t>
+      </w:r>
+      <w:r>
+        <w:rPr>
+          <w:rFonts w:hint="eastAsia"/>
+          <w:highlight w:val="yellow"/>
+          <w:lang w:eastAsia="zh-CN"/>
+        </w:rPr>
+        <w:t>平衡用户需求率和</w:t>
       </w:r>
       <w:proofErr w:type="gramStart"/>
       <w:r>
         <w:rPr>
           <w:rFonts w:hint="eastAsia"/>
+          <w:highlight w:val="yellow"/>
           <w:lang w:eastAsia="zh-CN"/>
         </w:rPr>
         <w:t>日费用</w:t>
@@ -739,6 +1022,7 @@
       <w:r>
         <w:rPr>
           <w:rFonts w:hint="eastAsia"/>
+          <w:highlight w:val="yellow"/>
           <w:lang w:eastAsia="zh-CN"/>
         </w:rPr>
         <w:t>?</w:t>
@@ -772,20 +1056,41 @@
         <w:rPr>
           <w:lang w:eastAsia="zh-CN"/>
         </w:rPr>
-        <w:t>（1）若在该区域新增5个站点（自行指定位置及容量），如何调整</w:t>
+        <w:t>（1）若在该区域</w:t>
+      </w:r>
+      <w:r>
+        <w:rPr>
+          <w:highlight w:val="yellow"/>
+          <w:lang w:eastAsia="zh-CN"/>
+        </w:rPr>
+        <w:t>新增5个站点（自行指定位置及容量）</w:t>
+      </w:r>
+      <w:r>
+        <w:rPr>
+          <w:lang w:eastAsia="zh-CN"/>
+        </w:rPr>
+        <w:t>，如何调整</w:t>
       </w:r>
       <w:r>
         <w:rPr>
           <w:rFonts w:hint="eastAsia"/>
+          <w:highlight w:val="yellow"/>
           <w:lang w:eastAsia="zh-CN"/>
         </w:rPr>
         <w:t>调度</w:t>
       </w:r>
       <w:r>
         <w:rPr>
-          <w:lang w:eastAsia="zh-CN"/>
-        </w:rPr>
-        <w:t>模型使其适用？</w:t>
+          <w:highlight w:val="yellow"/>
+          <w:lang w:eastAsia="zh-CN"/>
+        </w:rPr>
+        <w:t>模型</w:t>
+      </w:r>
+      <w:r>
+        <w:rPr>
+          <w:lang w:eastAsia="zh-CN"/>
+        </w:rPr>
+        <w:t>使其适用？</w:t>
       </w:r>
     </w:p>
     <w:p>
@@ -825,7 +1130,6 @@
         <w:ind w:firstLine="562"/>
         <w:jc w:val="both"/>
         <w:rPr>
-          <w:rFonts w:hint="eastAsia"/>
           <w:lang w:eastAsia="zh-CN"/>
         </w:rPr>
       </w:pPr>

</xml_diff>